<commit_message>
Adding pdfs and docx for module 6 homework, as well as preliminary results assignment.
</commit_message>
<xml_diff>
--- a/Course_Project/Analytic_Plan/Analytic_Plan_RCW.docx
+++ b/Course_Project/Analytic_Plan/Analytic_Plan_RCW.docx
@@ -2975,13 +2975,7 @@
               <w:rPr>
                 <w:rFonts w:ascii="Times New Roman" w:hAnsi="Times New Roman" w:cs="Times New Roman"/>
               </w:rPr>
-              <w:t>-</w:t>
-            </w:r>
-            <w:r>
-              <w:rPr>
-                <w:rFonts w:ascii="Times New Roman" w:hAnsi="Times New Roman" w:cs="Times New Roman"/>
-              </w:rPr>
-              <w:t>0.150005</w:t>
+              <w:t>-0.150005</w:t>
             </w:r>
           </w:p>
         </w:tc>
@@ -3579,13 +3573,7 @@
               <w:rPr>
                 <w:rFonts w:ascii="Times New Roman" w:hAnsi="Times New Roman" w:cs="Times New Roman"/>
               </w:rPr>
-              <w:t>-</w:t>
-            </w:r>
-            <w:r>
-              <w:rPr>
-                <w:rFonts w:ascii="Times New Roman" w:hAnsi="Times New Roman" w:cs="Times New Roman"/>
-              </w:rPr>
-              <w:t>0.000285</w:t>
+              <w:t>-0.000285</w:t>
             </w:r>
           </w:p>
         </w:tc>
@@ -3701,13 +3689,7 @@
               <w:rPr>
                 <w:rFonts w:ascii="Times New Roman" w:hAnsi="Times New Roman" w:cs="Times New Roman"/>
               </w:rPr>
-              <w:t>-</w:t>
-            </w:r>
-            <w:r>
-              <w:rPr>
-                <w:rFonts w:ascii="Times New Roman" w:hAnsi="Times New Roman" w:cs="Times New Roman"/>
-              </w:rPr>
-              <w:t>0.131063</w:t>
+              <w:t>-0.131063</w:t>
             </w:r>
           </w:p>
         </w:tc>
@@ -3831,13 +3813,7 @@
               <w:rPr>
                 <w:rFonts w:ascii="Times New Roman" w:hAnsi="Times New Roman" w:cs="Times New Roman"/>
               </w:rPr>
-              <w:t>-</w:t>
-            </w:r>
-            <w:r>
-              <w:rPr>
-                <w:rFonts w:ascii="Times New Roman" w:hAnsi="Times New Roman" w:cs="Times New Roman"/>
-              </w:rPr>
-              <w:t>0.168598</w:t>
+              <w:t>-0.168598</w:t>
             </w:r>
           </w:p>
         </w:tc>
@@ -3955,13 +3931,7 @@
               <w:rPr>
                 <w:rFonts w:ascii="Times New Roman" w:hAnsi="Times New Roman" w:cs="Times New Roman"/>
               </w:rPr>
-              <w:t>-</w:t>
-            </w:r>
-            <w:r>
-              <w:rPr>
-                <w:rFonts w:ascii="Times New Roman" w:hAnsi="Times New Roman" w:cs="Times New Roman"/>
-              </w:rPr>
-              <w:t>0.371403</w:t>
+              <w:t>-0.371403</w:t>
             </w:r>
           </w:p>
         </w:tc>
@@ -4077,13 +4047,7 @@
               <w:rPr>
                 <w:rFonts w:ascii="Times New Roman" w:hAnsi="Times New Roman" w:cs="Times New Roman"/>
               </w:rPr>
-              <w:t>-</w:t>
-            </w:r>
-            <w:r>
-              <w:rPr>
-                <w:rFonts w:ascii="Times New Roman" w:hAnsi="Times New Roman" w:cs="Times New Roman"/>
-              </w:rPr>
-              <w:t>0.290054</w:t>
+              <w:t>-0.290054</w:t>
             </w:r>
           </w:p>
         </w:tc>
@@ -4201,13 +4165,7 @@
               <w:rPr>
                 <w:rFonts w:ascii="Times New Roman" w:hAnsi="Times New Roman" w:cs="Times New Roman"/>
               </w:rPr>
-              <w:t>-</w:t>
-            </w:r>
-            <w:r>
-              <w:rPr>
-                <w:rFonts w:ascii="Times New Roman" w:hAnsi="Times New Roman" w:cs="Times New Roman"/>
-              </w:rPr>
-              <w:t>0.178410</w:t>
+              <w:t>-0.178410</w:t>
             </w:r>
           </w:p>
         </w:tc>
@@ -5411,19 +5369,7 @@
         <w:rPr>
           <w:rFonts w:ascii="Times New Roman" w:hAnsi="Times New Roman" w:cs="Times New Roman"/>
         </w:rPr>
-        <w:t xml:space="preserve"> </w:t>
-      </w:r>
-      <w:r>
-        <w:rPr>
-          <w:rFonts w:ascii="Times New Roman" w:hAnsi="Times New Roman" w:cs="Times New Roman"/>
-        </w:rPr>
-        <w:t>This variable would be called</w:t>
-      </w:r>
-      <w:r>
-        <w:rPr>
-          <w:rFonts w:ascii="Times New Roman" w:hAnsi="Times New Roman" w:cs="Times New Roman"/>
-        </w:rPr>
-        <w:t xml:space="preserve"> </w:t>
+        <w:t xml:space="preserve"> This variable would be called </w:t>
       </w:r>
       <w:proofErr w:type="spellStart"/>
       <w:r>
@@ -5517,13 +5463,7 @@
         <w:rPr>
           <w:rFonts w:ascii="Times New Roman" w:hAnsi="Times New Roman" w:cs="Times New Roman"/>
         </w:rPr>
-        <w:t>Average Utilization Ratio</w:t>
-      </w:r>
-      <w:r>
-        <w:rPr>
-          <w:rFonts w:ascii="Times New Roman" w:hAnsi="Times New Roman" w:cs="Times New Roman"/>
-        </w:rPr>
-        <w:t xml:space="preserve"> multiplied by Credit Limit would result in the average </w:t>
+        <w:t xml:space="preserve">Average Utilization Ratio multiplied by Credit Limit would result in the average </w:t>
       </w:r>
       <w:r>
         <w:rPr>
@@ -5559,13 +5499,7 @@
         <w:rPr>
           <w:rFonts w:ascii="Times New Roman" w:hAnsi="Times New Roman" w:cs="Times New Roman"/>
         </w:rPr>
-        <w:t>Total Transaction Amount</w:t>
-      </w:r>
-      <w:r>
-        <w:rPr>
-          <w:rFonts w:ascii="Times New Roman" w:hAnsi="Times New Roman" w:cs="Times New Roman"/>
-        </w:rPr>
-        <w:t xml:space="preserve"> </w:t>
+        <w:t xml:space="preserve">Total Transaction Amount </w:t>
       </w:r>
       <w:r>
         <w:rPr>
@@ -5607,19 +5541,7 @@
         <w:rPr>
           <w:rFonts w:ascii="Times New Roman" w:hAnsi="Times New Roman" w:cs="Times New Roman"/>
         </w:rPr>
-        <w:t xml:space="preserve"> </w:t>
-      </w:r>
-      <w:r>
-        <w:rPr>
-          <w:rFonts w:ascii="Times New Roman" w:hAnsi="Times New Roman" w:cs="Times New Roman"/>
-        </w:rPr>
-        <w:t>This variable would be called</w:t>
-      </w:r>
-      <w:r>
-        <w:rPr>
-          <w:rFonts w:ascii="Times New Roman" w:hAnsi="Times New Roman" w:cs="Times New Roman"/>
-        </w:rPr>
-        <w:t xml:space="preserve"> </w:t>
+        <w:t xml:space="preserve"> This variable would be called </w:t>
       </w:r>
       <w:proofErr w:type="spellStart"/>
       <w:r>
@@ -5719,13 +5641,7 @@
         <w:rPr>
           <w:rFonts w:ascii="Times New Roman" w:hAnsi="Times New Roman" w:cs="Times New Roman"/>
         </w:rPr>
-        <w:t xml:space="preserve"> </w:t>
-      </w:r>
-      <w:r>
-        <w:rPr>
-          <w:rFonts w:ascii="Times New Roman" w:hAnsi="Times New Roman" w:cs="Times New Roman"/>
-        </w:rPr>
-        <w:t xml:space="preserve">This variable would be called </w:t>
+        <w:t xml:space="preserve"> This variable would be called </w:t>
       </w:r>
       <w:proofErr w:type="spellStart"/>
       <w:r>
@@ -5806,19 +5722,7 @@
         <w:rPr>
           <w:rFonts w:ascii="Times New Roman" w:hAnsi="Times New Roman" w:cs="Times New Roman"/>
         </w:rPr>
-        <w:t xml:space="preserve">be the variables with relevance scores greater than 0.5 (as identified in the </w:t>
-      </w:r>
-      <w:r>
-        <w:rPr>
-          <w:rFonts w:ascii="Times New Roman" w:hAnsi="Times New Roman" w:cs="Times New Roman"/>
-        </w:rPr>
-        <w:t>Dataset Overview and Exploratory Data Analysis</w:t>
-      </w:r>
-      <w:r>
-        <w:rPr>
-          <w:rFonts w:ascii="Times New Roman" w:hAnsi="Times New Roman" w:cs="Times New Roman"/>
-        </w:rPr>
-        <w:t xml:space="preserve"> section)</w:t>
+        <w:t>be the variables with relevance scores greater than 0.5 (as identified in the Dataset Overview and Exploratory Data Analysis section)</w:t>
       </w:r>
       <w:r>
         <w:rPr>
@@ -6150,6 +6054,9 @@
           </w:tcPr>
           <w:p>
             <w:pPr>
+              <w:tabs>
+                <w:tab w:val="left" w:pos="2817"/>
+              </w:tabs>
               <w:rPr>
                 <w:rFonts w:ascii="Times New Roman" w:hAnsi="Times New Roman" w:cs="Times New Roman"/>
               </w:rPr>
@@ -6699,13 +6606,7 @@
         <w:rPr>
           <w:rFonts w:ascii="Times New Roman" w:hAnsi="Times New Roman" w:cs="Times New Roman"/>
         </w:rPr>
-        <w:t>‘Existing Customer’</w:t>
-      </w:r>
-      <w:r>
-        <w:rPr>
-          <w:rFonts w:ascii="Times New Roman" w:hAnsi="Times New Roman" w:cs="Times New Roman"/>
-        </w:rPr>
-        <w:t xml:space="preserve"> observations could be</w:t>
+        <w:t>‘Existing Customer’ observations could be</w:t>
       </w:r>
       <w:r>
         <w:rPr>
@@ -6925,19 +6826,7 @@
         <w:rPr>
           <w:rFonts w:ascii="Times New Roman" w:hAnsi="Times New Roman" w:cs="Times New Roman"/>
         </w:rPr>
-        <w:t xml:space="preserve">based on </w:t>
-      </w:r>
-      <w:r>
-        <w:rPr>
-          <w:rFonts w:ascii="Times New Roman" w:hAnsi="Times New Roman" w:cs="Times New Roman"/>
-        </w:rPr>
-        <w:t>the ratio of true positives to the total number of actual positives</w:t>
-      </w:r>
-      <w:r>
-        <w:rPr>
-          <w:rFonts w:ascii="Times New Roman" w:hAnsi="Times New Roman" w:cs="Times New Roman"/>
-        </w:rPr>
-        <w:t>.</w:t>
+        <w:t>based on the ratio of true positives to the total number of actual positives.</w:t>
       </w:r>
     </w:p>
     <w:p>
@@ -7069,19 +6958,7 @@
         <w:rPr>
           <w:rFonts w:ascii="Times New Roman" w:hAnsi="Times New Roman" w:cs="Times New Roman"/>
         </w:rPr>
-        <w:t xml:space="preserve"> </w:t>
-      </w:r>
-      <w:r>
-        <w:rPr>
-          <w:rFonts w:ascii="Times New Roman" w:hAnsi="Times New Roman" w:cs="Times New Roman"/>
-        </w:rPr>
-        <w:t>(2 * (Precision * Recall) / (Precision + Recall))</w:t>
-      </w:r>
-      <w:r>
-        <w:rPr>
-          <w:rFonts w:ascii="Times New Roman" w:hAnsi="Times New Roman" w:cs="Times New Roman"/>
-        </w:rPr>
-        <w:t>.</w:t>
+        <w:t xml:space="preserve"> (2 * (Precision * Recall) / (Precision + Recall)).</w:t>
       </w:r>
     </w:p>
     <w:p>
@@ -8039,6 +7916,7 @@
   <w:style w:type="character" w:default="1" w:styleId="DefaultParagraphFont">
     <w:name w:val="Default Paragraph Font"/>
     <w:uiPriority w:val="1"/>
+    <w:semiHidden/>
     <w:unhideWhenUsed/>
   </w:style>
   <w:style w:type="table" w:default="1" w:styleId="TableNormal">

</xml_diff>